<commit_message>
chore: sanitizar rastros pessoais antes da entrega (sanitize-delivery)
Remove metadado de autor embutido no logo.png (XMP do Canva trazia
nome completo), genericiza a referência ao repositório GitHub pessoal
na documentação técnica, e gera a versão .docx do documento de
pendências. Também removido do banco um convite de teste que usava
e-mail pessoal como destinatário (ação direta no Supabase, fora deste
commit).
</commit_message>
<xml_diff>
--- a/docs/documentacao-tecnica-scal.docx
+++ b/docs/documentacao-tecnica-scal.docx
@@ -4,17 +4,8 @@
   <w:body>
     <w:sectPr>
       <w:pgSz w:w="12240" w:h="15840" w:orient="portrait"/>
-      <w:pgMar w:top="720" w:right="720" w:bottom="720" w:left="720" w:header="undefined" w:footer="undefined" w:gutter="undefined"/>
+      <w:pgMar w:top="1440" w:right="1800" w:bottom="1440" w:left="1800" w:header="720" w:footer="720" w:gutter="0"/>
     </w:sectPr>
-    <w:p>
-      <w:pPr>
-        <w:spacing w:lineRule="auto"/>
-      </w:pPr>
-      <w:r>
-        <w:rPr/>
-        <w:t xml:space="preserve"/>
-      </w:r>
-    </w:p>
     <w:p>
       <w:pPr>
         <w:pStyle w:val="Heading1"/>
@@ -204,11 +195,13 @@
         <w:jc w:val="center"/>
       </w:tblPr>
       <w:tblGrid>
-        <w:gridCol w:w="5400"/>
-        <w:gridCol w:w="5400"/>
+        <w:gridCol w:w="4320"/>
+        <w:gridCol w:w="4320"/>
       </w:tblGrid>
       <w:tr>
-        <w:trPr/>
+        <w:trPr>
+          <w:cantSplit/>
+        </w:trPr>
         <w:tc>
           <w:tcPr>
             <w:tcBorders>
@@ -249,11 +242,13 @@
         </w:tc>
       </w:tr>
       <w:tblGrid>
-        <w:gridCol w:w="5400"/>
-        <w:gridCol w:w="5400"/>
+        <w:gridCol w:w="4320"/>
+        <w:gridCol w:w="4320"/>
       </w:tblGrid>
       <w:tr>
-        <w:trPr/>
+        <w:trPr>
+          <w:cantSplit/>
+        </w:trPr>
         <w:tc>
           <w:tcPr>
             <w:tcBorders>
@@ -294,7 +289,9 @@
         </w:tc>
       </w:tr>
       <w:tr>
-        <w:trPr/>
+        <w:trPr>
+          <w:cantSplit/>
+        </w:trPr>
         <w:tc>
           <w:tcPr>
             <w:tcBorders>
@@ -335,7 +332,9 @@
         </w:tc>
       </w:tr>
       <w:tr>
-        <w:trPr/>
+        <w:trPr>
+          <w:cantSplit/>
+        </w:trPr>
         <w:tc>
           <w:tcPr>
             <w:tcBorders>
@@ -376,7 +375,9 @@
         </w:tc>
       </w:tr>
       <w:tr>
-        <w:trPr/>
+        <w:trPr>
+          <w:cantSplit/>
+        </w:trPr>
         <w:tc>
           <w:tcPr>
             <w:tcBorders>
@@ -437,7 +438,9 @@
         </w:tc>
       </w:tr>
       <w:tr>
-        <w:trPr/>
+        <w:trPr>
+          <w:cantSplit/>
+        </w:trPr>
         <w:tc>
           <w:tcPr>
             <w:tcBorders>
@@ -471,16 +474,16 @@
               <w:spacing w:lineRule="auto"/>
             </w:pPr>
             <w:r>
-              <w:rPr>
-                <w:highlight w:val="lightGray"/>
-              </w:rPr>
-              <w:t xml:space="preserve">github.com/idsystems17/Scal</w:t>
+              <w:rPr/>
+              <w:t xml:space="preserve">a definir na conta que for hospedar o projeto dali em diante</w:t>
             </w:r>
           </w:p>
         </w:tc>
       </w:tr>
       <w:tr>
-        <w:trPr/>
+        <w:trPr>
+          <w:cantSplit/>
+        </w:trPr>
         <w:tc>
           <w:tcPr>
             <w:tcBorders>
@@ -634,12 +637,14 @@
         <w:jc w:val="center"/>
       </w:tblPr>
       <w:tblGrid>
-        <w:gridCol w:w="3600"/>
-        <w:gridCol w:w="3600"/>
-        <w:gridCol w:w="3600"/>
+        <w:gridCol w:w="2880"/>
+        <w:gridCol w:w="2880"/>
+        <w:gridCol w:w="2880"/>
       </w:tblGrid>
       <w:tr>
-        <w:trPr/>
+        <w:trPr>
+          <w:cantSplit/>
+        </w:trPr>
         <w:tc>
           <w:tcPr>
             <w:tcBorders>
@@ -699,12 +704,14 @@
         </w:tc>
       </w:tr>
       <w:tblGrid>
-        <w:gridCol w:w="3600"/>
-        <w:gridCol w:w="3600"/>
-        <w:gridCol w:w="3600"/>
+        <w:gridCol w:w="2880"/>
+        <w:gridCol w:w="2880"/>
+        <w:gridCol w:w="2880"/>
       </w:tblGrid>
       <w:tr>
-        <w:trPr/>
+        <w:trPr>
+          <w:cantSplit/>
+        </w:trPr>
         <w:tc>
           <w:tcPr>
             <w:tcBorders>
@@ -768,7 +775,9 @@
         </w:tc>
       </w:tr>
       <w:tr>
-        <w:trPr/>
+        <w:trPr>
+          <w:cantSplit/>
+        </w:trPr>
         <w:tc>
           <w:tcPr>
             <w:tcBorders>
@@ -832,7 +841,9 @@
         </w:tc>
       </w:tr>
       <w:tr>
-        <w:trPr/>
+        <w:trPr>
+          <w:cantSplit/>
+        </w:trPr>
         <w:tc>
           <w:tcPr>
             <w:tcBorders>
@@ -1377,11 +1388,13 @@
         <w:jc w:val="center"/>
       </w:tblPr>
       <w:tblGrid>
-        <w:gridCol w:w="5400"/>
-        <w:gridCol w:w="5400"/>
+        <w:gridCol w:w="4320"/>
+        <w:gridCol w:w="4320"/>
       </w:tblGrid>
       <w:tr>
-        <w:trPr/>
+        <w:trPr>
+          <w:cantSplit/>
+        </w:trPr>
         <w:tc>
           <w:tcPr>
             <w:tcBorders>
@@ -1422,11 +1435,13 @@
         </w:tc>
       </w:tr>
       <w:tblGrid>
-        <w:gridCol w:w="5400"/>
-        <w:gridCol w:w="5400"/>
+        <w:gridCol w:w="4320"/>
+        <w:gridCol w:w="4320"/>
       </w:tblGrid>
       <w:tr>
-        <w:trPr/>
+        <w:trPr>
+          <w:cantSplit/>
+        </w:trPr>
         <w:tc>
           <w:tcPr>
             <w:tcBorders>
@@ -1469,7 +1484,9 @@
         </w:tc>
       </w:tr>
       <w:tr>
-        <w:trPr/>
+        <w:trPr>
+          <w:cantSplit/>
+        </w:trPr>
         <w:tc>
           <w:tcPr>
             <w:tcBorders>
@@ -1563,7 +1580,9 @@
         </w:tc>
       </w:tr>
       <w:tr>
-        <w:trPr/>
+        <w:trPr>
+          <w:cantSplit/>
+        </w:trPr>
         <w:tc>
           <w:tcPr>
             <w:tcBorders>
@@ -1606,7 +1625,9 @@
         </w:tc>
       </w:tr>
       <w:tr>
-        <w:trPr/>
+        <w:trPr>
+          <w:cantSplit/>
+        </w:trPr>
         <w:tc>
           <w:tcPr>
             <w:tcBorders>
@@ -1649,7 +1670,9 @@
         </w:tc>
       </w:tr>
       <w:tr>
-        <w:trPr/>
+        <w:trPr>
+          <w:cantSplit/>
+        </w:trPr>
         <w:tc>
           <w:tcPr>
             <w:tcBorders>
@@ -1692,7 +1715,9 @@
         </w:tc>
       </w:tr>
       <w:tr>
-        <w:trPr/>
+        <w:trPr>
+          <w:cantSplit/>
+        </w:trPr>
         <w:tc>
           <w:tcPr>
             <w:tcBorders>
@@ -1735,7 +1760,9 @@
         </w:tc>
       </w:tr>
       <w:tr>
-        <w:trPr/>
+        <w:trPr>
+          <w:cantSplit/>
+        </w:trPr>
         <w:tc>
           <w:tcPr>
             <w:tcBorders>
@@ -1778,7 +1805,9 @@
         </w:tc>
       </w:tr>
       <w:tr>
-        <w:trPr/>
+        <w:trPr>
+          <w:cantSplit/>
+        </w:trPr>
         <w:tc>
           <w:tcPr>
             <w:tcBorders>
@@ -1821,7 +1850,9 @@
         </w:tc>
       </w:tr>
       <w:tr>
-        <w:trPr/>
+        <w:trPr>
+          <w:cantSplit/>
+        </w:trPr>
         <w:tc>
           <w:tcPr>
             <w:tcBorders>
@@ -1864,7 +1895,9 @@
         </w:tc>
       </w:tr>
       <w:tr>
-        <w:trPr/>
+        <w:trPr>
+          <w:cantSplit/>
+        </w:trPr>
         <w:tc>
           <w:tcPr>
             <w:tcBorders>
@@ -1907,7 +1940,9 @@
         </w:tc>
       </w:tr>
       <w:tr>
-        <w:trPr/>
+        <w:trPr>
+          <w:cantSplit/>
+        </w:trPr>
         <w:tc>
           <w:tcPr>
             <w:tcBorders>
@@ -1950,7 +1985,9 @@
         </w:tc>
       </w:tr>
       <w:tr>
-        <w:trPr/>
+        <w:trPr>
+          <w:cantSplit/>
+        </w:trPr>
         <w:tc>
           <w:tcPr>
             <w:tcBorders>
@@ -2202,12 +2239,14 @@
         <w:jc w:val="center"/>
       </w:tblPr>
       <w:tblGrid>
-        <w:gridCol w:w="3600"/>
-        <w:gridCol w:w="3600"/>
-        <w:gridCol w:w="3600"/>
+        <w:gridCol w:w="2880"/>
+        <w:gridCol w:w="2880"/>
+        <w:gridCol w:w="2880"/>
       </w:tblGrid>
       <w:tr>
-        <w:trPr/>
+        <w:trPr>
+          <w:cantSplit/>
+        </w:trPr>
         <w:tc>
           <w:tcPr>
             <w:tcBorders>
@@ -2267,12 +2306,14 @@
         </w:tc>
       </w:tr>
       <w:tblGrid>
-        <w:gridCol w:w="3600"/>
-        <w:gridCol w:w="3600"/>
-        <w:gridCol w:w="3600"/>
+        <w:gridCol w:w="2880"/>
+        <w:gridCol w:w="2880"/>
+        <w:gridCol w:w="2880"/>
       </w:tblGrid>
       <w:tr>
-        <w:trPr/>
+        <w:trPr>
+          <w:cantSplit/>
+        </w:trPr>
         <w:tc>
           <w:tcPr>
             <w:tcBorders>
@@ -2343,7 +2384,9 @@
         </w:tc>
       </w:tr>
       <w:tr>
-        <w:trPr/>
+        <w:trPr>
+          <w:cantSplit/>
+        </w:trPr>
         <w:tc>
           <w:tcPr>
             <w:tcBorders>
@@ -2414,7 +2457,9 @@
         </w:tc>
       </w:tr>
       <w:tr>
-        <w:trPr/>
+        <w:trPr>
+          <w:cantSplit/>
+        </w:trPr>
         <w:tc>
           <w:tcPr>
             <w:tcBorders>
@@ -2474,7 +2519,9 @@
         </w:tc>
       </w:tr>
       <w:tr>
-        <w:trPr/>
+        <w:trPr>
+          <w:cantSplit/>
+        </w:trPr>
         <w:tc>
           <w:tcPr>
             <w:tcBorders>
@@ -2572,11 +2619,13 @@
         <w:jc w:val="center"/>
       </w:tblPr>
       <w:tblGrid>
-        <w:gridCol w:w="5400"/>
-        <w:gridCol w:w="5400"/>
+        <w:gridCol w:w="4320"/>
+        <w:gridCol w:w="4320"/>
       </w:tblGrid>
       <w:tr>
-        <w:trPr/>
+        <w:trPr>
+          <w:cantSplit/>
+        </w:trPr>
         <w:tc>
           <w:tcPr>
             <w:tcBorders>
@@ -2617,11 +2666,13 @@
         </w:tc>
       </w:tr>
       <w:tblGrid>
-        <w:gridCol w:w="5400"/>
-        <w:gridCol w:w="5400"/>
+        <w:gridCol w:w="4320"/>
+        <w:gridCol w:w="4320"/>
       </w:tblGrid>
       <w:tr>
-        <w:trPr/>
+        <w:trPr>
+          <w:cantSplit/>
+        </w:trPr>
         <w:tc>
           <w:tcPr>
             <w:tcBorders>
@@ -2684,7 +2735,9 @@
         </w:tc>
       </w:tr>
       <w:tr>
-        <w:trPr/>
+        <w:trPr>
+          <w:cantSplit/>
+        </w:trPr>
         <w:tc>
           <w:tcPr>
             <w:tcBorders>
@@ -2727,7 +2780,9 @@
         </w:tc>
       </w:tr>
       <w:tr>
-        <w:trPr/>
+        <w:trPr>
+          <w:cantSplit/>
+        </w:trPr>
         <w:tc>
           <w:tcPr>
             <w:tcBorders>
@@ -2770,7 +2825,9 @@
         </w:tc>
       </w:tr>
       <w:tr>
-        <w:trPr/>
+        <w:trPr>
+          <w:cantSplit/>
+        </w:trPr>
         <w:tc>
           <w:tcPr>
             <w:tcBorders>
@@ -2813,7 +2870,9 @@
         </w:tc>
       </w:tr>
       <w:tr>
-        <w:trPr/>
+        <w:trPr>
+          <w:cantSplit/>
+        </w:trPr>
         <w:tc>
           <w:tcPr>
             <w:tcBorders>
@@ -2856,7 +2915,9 @@
         </w:tc>
       </w:tr>
       <w:tr>
-        <w:trPr/>
+        <w:trPr>
+          <w:cantSplit/>
+        </w:trPr>
         <w:tc>
           <w:tcPr>
             <w:tcBorders>
@@ -2899,7 +2960,9 @@
         </w:tc>
       </w:tr>
       <w:tr>
-        <w:trPr/>
+        <w:trPr>
+          <w:cantSplit/>
+        </w:trPr>
         <w:tc>
           <w:tcPr>
             <w:tcBorders>
@@ -3083,6 +3146,27 @@
       <w:r>
         <w:rPr/>
         <w:t xml:space="preserve"> — remover ou manter protegido por token permanentemente antes do lançamento público</w:t>
+      </w:r>
+    </w:p>
+    <w:p>
+      <w:pPr>
+        <w:numPr>
+          <w:ilvl w:val="0"/>
+          <w:numId w:val="8"/>
+        </w:numPr>
+        <w:spacing w:lineRule="auto"/>
+      </w:pPr>
+      <w:r>
+        <w:rPr/>
+        <w:t xml:space="preserve">Cobrança variável de 0,5% via Asaas (boleto/Pix sobre valor atribuído acima de R$ 50 mil) — briefing em </w:t>
+      </w:r>
+      <w:r>
+        <w:rPr/>
+        <w:t xml:space="preserve">docs/briefing-cobranca-asaas-scal.md</w:t>
+      </w:r>
+      <w:r>
+        <w:rPr/>
+        <w:t xml:space="preserve">, não é prioridade imediata, aguarda validação do restante do SCAL e decisão sobre 4 perguntas em aberto (cobrança automática vs. aprovação manual, prazo de vencimento, régua de atraso, cálculo mensal vs. por venda)</w:t>
       </w:r>
     </w:p>
   </w:body>

</xml_diff>